<commit_message>
Rewrite diversity statement intro to cover both DEI directions: content and classroom practice
Co-Authored-By: Claude Fable 5 <noreply@anthropic.com>
Claude-Session: https://claude.ai/code/session_01PiEg6Y7uKo8D9Ly2hNuxQc
</commit_message>
<xml_diff>
--- a/stony-brook-application/diversity-statement-highlighted-changes.docx
+++ b/stony-brook-application/diversity-statement-highlighted-changes.docx
@@ -17,7 +17,7 @@
           <w:i/>
           <w:sz w:val="18"/>
         </w:rPr>
-        <w:t>1. Rewrote the opening examples so they are clearly attributed: the Cambodian American stroke disparity now comes from YOUR disaggregated analyses, and the Latino example from YOUR community health screenings. Added connective language explaining why these examples anchor the whole statement (counting as justice; training students to see people inside averages). PLEASE VERIFY the four-times figure is from your own analyses; if it is from the literature instead, see the alternate wording provided in chat.</w:t>
+        <w:t>1. Rewrote the second half of the introduction to fix the mismatch you identified: the old intro was only about teaching students to see hidden populations (DEI as course content), while the body is mostly about inclusive teaching practice. The new intro extends the counting insight to the classroom (courses designed for an 'imagined typical student' hide real students the way aggregate categories hide communities) and states the commitment as running in two directions: training students to see hidden people in data, AND designing courses, mentoring, and service so no student stays hidden. Kept 'social justice' and 'the foundation of responsible public health education.'</w:t>
       </w:r>
     </w:p>
     <w:p>
@@ -26,7 +26,7 @@
           <w:i/>
           <w:sz w:val="18"/>
         </w:rPr>
-        <w:t>2. Clarified Boston University as your bachelor's degree in economics and Stanford as your master's in education policy. Please confirm the exact degree names.</w:t>
+        <w:t>2. Dropped the clause 'a disparity the aggregate label had hidden' from the stroke example since the new classroom sentence now carries the 'hiding' idea (a deletion, so not highlightable).</w:t>
       </w:r>
     </w:p>
     <w:p>
@@ -35,7 +35,7 @@
           <w:i/>
           <w:sz w:val="18"/>
         </w:rPr>
-        <w:t>3. Added the job description's exact terms: 'social justice' (opening paragraph, replacing 'justice') and 'cultural competency' (classroom practice paragraph, tied to your culturally tailored intervention work).</w:t>
+        <w:t>3. Paragraph 4 now opens 'I translate this double vision into concrete classroom practice,' echoing the intro, and adds 'Rather than teaching to an average that fits no one' before the multiple-pathways sentence, landing the intro's classroom-averages idea in practice.</w:t>
       </w:r>
     </w:p>
     <w:p>
@@ -44,7 +44,7 @@
           <w:i/>
           <w:sz w:val="18"/>
         </w:rPr>
-        <w:t>4. Reframed the caregiving accommodation as co-created ('we worked together on a flexible completion plan'), a framing borrowed from your friend's statement without using her experiences.</w:t>
+        <w:t>4. Small trims for the word limit, listed so nothing is hidden: 'a diverse public research university that is' (before the HSI designations); 'firsthand' (Medicare sentence); 'specific' and 'as a possibility' (paragraph 3); 'both' (completion plan); 'from your family' (network sentence); tightened the APHA resources sentence; 'And when' to 'When'; 'so that' to 'so'; fixed a double space in the closing.</w:t>
       </w:r>
     </w:p>
     <w:p>
@@ -53,16 +53,7 @@
           <w:i/>
           <w:sz w:val="18"/>
         </w:rPr>
-        <w:t>5. Added one sentence in the closing offering curriculum-focused service, adapting your friend's curriculum-committee idea to match the job's 12.5% service expectation.</w:t>
-      </w:r>
-    </w:p>
-    <w:p>
-      <w:r>
-        <w:rPr>
-          <w:i/>
-          <w:sz w:val="18"/>
-        </w:rPr>
-        <w:t>Word count: 1,049 excluding the title.</w:t>
+        <w:t>Word count: 1,050 excluding the title.</w:t>
       </w:r>
     </w:p>
     <w:p/>
@@ -77,83 +68,53 @@
     </w:p>
     <w:p>
       <w:r>
-        <w:t xml:space="preserve">My understanding of diversity, equity, and inclusion begins with a simple observation that has shaped my entire career: the way we count people determines who we see. </w:t>
+        <w:t xml:space="preserve">My understanding of diversity, equity, and inclusion begins with a simple observation that has shaped my entire career: the way we count people determines who we see. My own research taught me this. When my disaggregated analyses of cardiovascular outcomes broke apart the single Asian American category in public health data, they revealed Cambodian American communities facing stroke risks four times higher than their Chinese American peers. My community practice taught me the same lesson. At health screenings alongside Latino families, I have seen how guidelines built on studies that underrepresent them can fail the people in front of me. </w:t>
       </w:r>
       <w:r>
         <w:rPr>
           <w:highlight w:val="yellow"/>
         </w:rPr>
-        <w:t>My own research taught me this. When my disaggregated analyses of cardiovascular outcomes broke apart the single Asian American category common in public health data, they revealed Cambodian American communities facing stroke risks four times higher than their Chinese American peers, a disparity the aggregate label had hidden. My community practice taught me the same lesson. At health screenings alongside Latino families, I have seen how guidelines built on studies that underrepresent them can fail the people in front of me. Who gets counted, how they get counted, and whose experiences remain hidden behind aggregate statistics are therefore not merely methodological concerns. They are questions of social justice, and they sit at the center of how I teach, mentor, and serve: training students to see the people inside the averages is the foundation of responsible public health education.</w:t>
+        <w:t>These are questions of social justice, not merely of method, and classrooms have averages of their own: a course designed for an imagined typical student hides real students just as an aggregate category hides a high-risk community. My commitment therefore runs in two directions. I train students to see the people hidden inside statistics, and I design my courses, mentoring, and service so that no student stays hidden inside my assumptions. This double vision is the foundation of responsible public health education.</w:t>
       </w:r>
     </w:p>
     <w:p>
       <w:r>
-        <w:t xml:space="preserve">My path to this understanding was not linear. I grew up in China and came to the United States for college, where I quickly learned that navigating an unfamiliar academic system requires more than intellectual ability. I did not know how to approach professors during office hours, how to ask for recommendation letters, or how graduate school applications worked, and nobody in my family had experience with American higher education. These early struggles gave me a visceral understanding of the hidden curriculum, the unwritten rules that determine academic success but are never formally taught. Later, </w:t>
+        <w:t>My path to this understanding was not linear. I grew up in China and came to the United States for college, where I quickly learned that navigating an unfamiliar academic system requires more than intellectual ability. I did not know how to approach professors during office hours, how to ask for recommendation letters, or how graduate school applications worked, and nobody in my family had experience with American higher education. These early struggles gave me a visceral understanding of the hidden curriculum, the unwritten rules that determine academic success but are never formally taught. Later, while completing my bachelor's degree in economics at Boston University, I studied how markets allocate resources and began questioning who gets left out of those models. While earning my master's in education policy at Stanford University, I investigated how higher education systems in different countries open or close doors for students from disadvantaged backgrounds. During nearly three years developing Medicare cost measures, I saw how payment policy could widen or narrow health disparities depending on whether social risk factors entered the models. Each transition taught me how systems that appear neutral can produce deeply unequal outcomes.</w:t>
+      </w:r>
+    </w:p>
+    <w:p>
+      <w:r>
+        <w:t>These experiences keep me attentive to the barriers underrepresented students face. First-generation students often lack access to the professional networks and funding opportunities that accelerate academic careers. Students from communities directly affected by health disparities bring invaluable lived expertise, yet they may not see their experiences reflected in course materials built around the populations that dominate the research literature. Students from underrepresented backgrounds frequently carry invisible burdens, serving as cultural translators, supporting family members financially, or managing the psychological weight of studying inequities that touch their own communities. I have mentored students navigating each of these challenges. One mentee, a first-generation Latina student, told me she had never considered graduate school until our conversations about her research potential. Another student, whose family had experienced the very food insecurity our research project examined, brought insights that fundamentally improved how we interpreted our data. These relationships have taught me that inclusion is not achieved through policy statements alone. It requires creating conditions in which students experience their full identities as assets rather than obstacles.</w:t>
+      </w:r>
+    </w:p>
+    <w:p>
+      <w:r>
+        <w:rPr>
+          <w:highlight w:val="yellow"/>
+        </w:rPr>
+        <w:t>I translate this double vision into concrete classroom practice.</w:t>
+      </w:r>
+      <w:r>
+        <w:t xml:space="preserve"> Teaching at UC Irvine, both a Hispanic-Serving Institution and an Asian American and Native American Pacific Islander-Serving Institution, I have worked with many first-generation students, students from immigrant families, working students, and student caregivers. </w:t>
       </w:r>
       <w:r>
         <w:rPr>
           <w:highlight w:val="yellow"/>
         </w:rPr>
-        <w:t>while completing my bachelor's degree in economics at Boston University,</w:t>
+        <w:t>Rather than teaching to an average that fits no one,</w:t>
       </w:r>
       <w:r>
-        <w:t xml:space="preserve"> I studied how markets allocate resources and began questioning who gets left out of those models. </w:t>
-      </w:r>
-      <w:r>
-        <w:rPr>
-          <w:highlight w:val="yellow"/>
-        </w:rPr>
-        <w:t>While earning my master's in education policy at Stanford University,</w:t>
-      </w:r>
-      <w:r>
-        <w:t xml:space="preserve"> I investigated how higher education systems in different countries open or close doors for students from disadvantaged backgrounds. During nearly three years developing Medicare cost measures, I saw firsthand how payment policy decisions could widen or narrow health disparities depending on whether social risk factors were incorporated into the models. Each transition taught me how systems that appear neutral can produce deeply unequal outcomes.</w:t>
+        <w:t xml:space="preserve"> I proactively design multiple pathways to success. I post materials early for students balancing work schedules, communicate with a clarity that supports English learners, and vary assessment formats so students can demonstrate mastery in ways aligned with their strengths. When one student's performance declined under caregiving responsibilities, we worked together on a flexible completion plan that honored their family and their learning goals. When another lacked reliable technology, I connected them with campus resources and adjusted deadlines. Students notice this support. One observed that I am “very fast in responding and finding solutions, creating an equitable learning environment,” and another reflected that mine was “the only class I have taken that truly considered the mental health of students.” I also intentionally select case studies and datasets reflecting the communities my students come from. This draws on my experience designing and evaluating culturally tailored cardiovascular interventions with Latino and Vietnamese families, work that taught me cultural competency is built through partnership rather than assumption. I treat systemic barriers to learning as the educational counterpart of the structural determinants of health, which makes inclusive teaching inseparable from the content of public health itself.</w:t>
       </w:r>
     </w:p>
     <w:p>
       <w:r>
-        <w:t>These experiences make me attentive to the specific barriers that underrepresented students face. First-generation students often lack access to the professional networks and funding opportunities that accelerate academic careers. Students from communities directly affected by health disparities bring invaluable lived expertise, yet they may not see their experiences reflected in course materials built around the populations that dominate the research literature. Students from underrepresented backgrounds frequently carry invisible burdens, serving as cultural translators, supporting family members financially, or managing the psychological weight of studying inequities that touch their own communities. I have mentored students navigating each of these challenges. One mentee, a first-generation Latina student, told me she had never considered graduate school as a possibility until our conversations about her research potential. Another student, whose family had experienced the very food insecurity our research project examined, brought insights that fundamentally improved how we interpreted our data. These relationships have taught me that inclusion is not achieved through policy statements alone. It requires creating conditions in which students experience their full identities as assets rather than obstacles.</w:t>
+        <w:t>Beyond my own classroom, I work to widen pathways into the profession. Through UC Irvine's Next Gen Pathways Program, I mentor incoming graduate students from underrepresented backgrounds, focusing on making the hidden curriculum explicit: how to write a conference abstract, how to identify funding opportunities, and how to build a professional network when you do not inherit one. I share my own experiences with rejection and failure, because students from marginalized backgrounds often read setbacks as confirmation that they do not belong, not as a normal part of academic life. In my professional service, I have developed resources for American Public Health Association student members attending their first professional conference and unsure how to navigate it. When I helped train 27 incoming graduate teaching assistants, I made diversity and inclusion a core workshop topic, so inclusive practice multiplies through every classroom those new instructors will lead.</w:t>
       </w:r>
     </w:p>
     <w:p>
       <w:r>
-        <w:t xml:space="preserve">I translate this understanding into concrete classroom practice. Teaching at UC Irvine, a diverse public research university that is both a Hispanic-Serving Institution and an Asian American and Native American Pacific Islander-Serving Institution, I have worked with many first-generation students, students from immigrant families, working students, and student caregivers. I proactively design multiple pathways to success. I post materials early for students balancing work schedules, communicate with a clarity that supports English learners, and vary assessment formats so students can demonstrate mastery in ways aligned with their strengths. When one student's performance declined under caregiving responsibilities, </w:t>
-      </w:r>
-      <w:r>
-        <w:rPr>
-          <w:highlight w:val="yellow"/>
-        </w:rPr>
-        <w:t>we worked together on a flexible completion plan</w:t>
-      </w:r>
-      <w:r>
-        <w:t xml:space="preserve"> that honored both their family and their learning goals. When another lacked reliable technology, I connected them with campus resources and adjusted deadlines. Students notice this support. One observed that I am “very fast in responding and finding solutions, creating an equitable learning environment,” and another reflected that mine was “the only class I have taken that truly considered the mental health of students.” I also intentionally select case studies and datasets reflecting the communities my students come from, drawing on my experience designing and evaluating culturally tailored cardiovascular interventions with Latino and Vietnamese families</w:t>
-      </w:r>
-      <w:r>
-        <w:rPr>
-          <w:highlight w:val="yellow"/>
-        </w:rPr>
-        <w:t>, work that taught me cultural competency is built through partnership rather than assumption</w:t>
-      </w:r>
-      <w:r>
-        <w:t>. I treat systemic barriers to learning as the educational counterpart of the structural determinants of health, which makes inclusive teaching inseparable from the content of public health itself.</w:t>
-      </w:r>
-    </w:p>
-    <w:p>
-      <w:r>
-        <w:t>Beyond my own classroom, I work to widen pathways into the profession. Through UC Irvine's Next Gen Pathways Program, I mentor incoming graduate students from underrepresented backgrounds, focusing on making the hidden curriculum explicit: how to write a conference abstract, how to identify funding opportunities, and how to build a professional network when you do not inherit one from your family. I share my own experiences with rejection and failure, because students from marginalized backgrounds often read setbacks as confirmation that they do not belong rather than as a normal part of academic life. In my professional service, I have developed resources for student members of the American Public Health Association who are attending their first professional conference and feel uncertain about navigating that environment. And when I helped train 27 incoming graduate teaching assistants, I made diversity and inclusion a core workshop topic, so that inclusive practice multiplies through every classroom those new instructors will lead.</w:t>
-      </w:r>
-    </w:p>
-    <w:p>
-      <w:r>
-        <w:t xml:space="preserve">I also know that this work is never finished. I continue to participate in workshops on inclusive pedagogy, seek honest dialogue with colleagues about supporting marginalized students, and use my role supporting new instructors to help build a teaching community that values equity at its core. </w:t>
-      </w:r>
-      <w:r>
-        <w:rPr>
-          <w:highlight w:val="yellow"/>
-        </w:rPr>
-        <w:t xml:space="preserve">I would also welcome curriculum-focused service, because curriculum design decides whose experiences count as core knowledge. </w:t>
-      </w:r>
-      <w:r>
-        <w:t>A diverse graduate student body enriches learning for everyone, and public health needs professionals who understand the communities they serve from the inside. Through my teaching, mentoring, and service, I am committed to making the pathway from student to public health professional one where diverse backgrounds are cultivated as sources of strength.</w:t>
+        <w:t>I also know that this work is never finished. I continue to participate in workshops on inclusive pedagogy, seek honest dialogue with colleagues about supporting marginalized students, and use my role supporting new instructors to help build a teaching community that values equity at its core. I would also welcome curriculum-focused service, because curriculum design decides whose experiences count as core knowledge. A diverse graduate student body enriches learning for everyone, and public health needs professionals who understand the communities they serve from the inside. Through my teaching, mentoring, and service, I am committed to making the pathway from student to public health professional one where diverse backgrounds are cultivated as sources of strength.</w:t>
       </w:r>
     </w:p>
     <w:sectPr>

</xml_diff>

<commit_message>
Regenerate diversity statement docx with highlighted round-3 changes
Co-Authored-By: Claude Fable 5 <noreply@anthropic.com>
Claude-Session: https://claude.ai/code/session_01PiEg6Y7uKo8D9Ly2hNuxQc
</commit_message>
<xml_diff>
--- a/stony-brook-application/diversity-statement-highlighted-changes.docx
+++ b/stony-brook-application/diversity-statement-highlighted-changes.docx
@@ -17,7 +17,7 @@
           <w:i/>
           <w:sz w:val="18"/>
         </w:rPr>
-        <w:t>1. Rewrote the second half of the introduction to fix the mismatch you identified: the old intro was only about teaching students to see hidden populations (DEI as course content), while the body is mostly about inclusive teaching practice. The new intro extends the counting insight to the classroom (courses designed for an 'imagined typical student' hide real students the way aggregate categories hide communities) and states the commitment as running in two directions: training students to see hidden people in data, AND designing courses, mentoring, and service so no student stays hidden. Kept 'social justice' and 'the foundation of responsible public health education.'</w:t>
+        <w:t>1. Broadened the second direction of your commitment: instead of only 'seeing people hidden inside aggregated statistics,' students now learn to see beyond averages in everything they do, recognize health disparities and their structural causes, treat inequities in their own communities as questions their training can answer, and pursue health for all, not health for some.</w:t>
       </w:r>
     </w:p>
     <w:p>
@@ -26,7 +26,7 @@
           <w:i/>
           <w:sz w:val="18"/>
         </w:rPr>
-        <w:t>2. Dropped the clause 'a disparity the aggregate label had hidden' from the stroke example since the new classroom sentence now carries the 'hiding' idea (a deletion, so not highlightable).</w:t>
+        <w:t>2. Replaced 'I translate this double vision into concrete classroom practice' with 'Creating those conditions is the daily work of my classroom,' which links directly to the last sentence of the previous paragraph (creating conditions where identities are assets).</w:t>
       </w:r>
     </w:p>
     <w:p>
@@ -35,25 +35,7 @@
           <w:i/>
           <w:sz w:val="18"/>
         </w:rPr>
-        <w:t>3. Paragraph 4 now opens 'I translate this double vision into concrete classroom practice,' echoing the intro, and adds 'Rather than teaching to an average that fits no one' before the multiple-pathways sentence, landing the intro's classroom-averages idea in practice.</w:t>
-      </w:r>
-    </w:p>
-    <w:p>
-      <w:r>
-        <w:rPr>
-          <w:i/>
-          <w:sz w:val="18"/>
-        </w:rPr>
-        <w:t>4. Small trims for the word limit, listed so nothing is hidden: 'a diverse public research university that is' (before the HSI designations); 'firsthand' (Medicare sentence); 'specific' and 'as a possibility' (paragraph 3); 'both' (completion plan); 'from your family' (network sentence); tightened the APHA resources sentence; 'And when' to 'When'; 'so that' to 'so'; fixed a double space in the closing.</w:t>
-      </w:r>
-    </w:p>
-    <w:p>
-      <w:r>
-        <w:rPr>
-          <w:i/>
-          <w:sz w:val="18"/>
-        </w:rPr>
-        <w:t>Word count: 1,050 excluding the title.</w:t>
+        <w:t>3. Everything else is your text verbatim, including all the words you restored in your latest version. Word count: 1,121 excluding the title (about 70 over the 1,050 target; optional trims listed in chat if you want to get back under).</w:t>
       </w:r>
     </w:p>
     <w:p/>
@@ -68,23 +50,26 @@
     </w:p>
     <w:p>
       <w:r>
-        <w:t xml:space="preserve">My understanding of diversity, equity, and inclusion begins with a simple observation that has shaped my entire career: the way we count people determines who we see. My own research taught me this. When my disaggregated analyses of cardiovascular outcomes broke apart the single Asian American category in public health data, they revealed Cambodian American communities facing stroke risks four times higher than their Chinese American peers. My community practice taught me the same lesson. At health screenings alongside Latino families, I have seen how guidelines built on studies that underrepresent them can fail the people in front of me. </w:t>
+        <w:t xml:space="preserve">My understanding of diversity, equity, and inclusion begins with a simple observation that has shaped my entire career: the way we count people determines who we see. My own research taught me this. When my disaggregated analyses of cardiovascular outcomes broke apart the single Asian American category common in public health data, they revealed Cambodian American communities facing stroke risks four times higher than their Chinese American peers, a disparity the aggregate label had hidden. My community practice taught me the same lesson. At health screenings alongside Latino families, I have seen how guidelines built on studies that underrepresent them can fail the people in front of me. These are questions of social justice, not merely of method, and classrooms have averages of their own: a course designed for an imagined typical student hides real students just as an aggregate category hides a high-risk community. My commitment therefore runs in two directions. I design my courses, mentoring, and service so that no student stays hidden inside my assumptions, </w:t>
       </w:r>
       <w:r>
         <w:rPr>
           <w:highlight w:val="yellow"/>
         </w:rPr>
-        <w:t>These are questions of social justice, not merely of method, and classrooms have averages of their own: a course designed for an imagined typical student hides real students just as an aggregate category hides a high-risk community. My commitment therefore runs in two directions. I train students to see the people hidden inside statistics, and I design my courses, mentoring, and service so that no student stays hidden inside my assumptions. This double vision is the foundation of responsible public health education.</w:t>
+        <w:t>and I train students to see beyond averages in everything they do: to recognize health disparities and the structures that produce them, to treat inequities in their own communities as questions their training can answer, and to pursue health for all, not health for some.</w:t>
+      </w:r>
+      <w:r>
+        <w:t xml:space="preserve"> This double vision is the foundation of responsible public health education.</w:t>
       </w:r>
     </w:p>
     <w:p>
       <w:r>
-        <w:t>My path to this understanding was not linear. I grew up in China and came to the United States for college, where I quickly learned that navigating an unfamiliar academic system requires more than intellectual ability. I did not know how to approach professors during office hours, how to ask for recommendation letters, or how graduate school applications worked, and nobody in my family had experience with American higher education. These early struggles gave me a visceral understanding of the hidden curriculum, the unwritten rules that determine academic success but are never formally taught. Later, while completing my bachelor's degree in economics at Boston University, I studied how markets allocate resources and began questioning who gets left out of those models. While earning my master's in education policy at Stanford University, I investigated how higher education systems in different countries open or close doors for students from disadvantaged backgrounds. During nearly three years developing Medicare cost measures, I saw how payment policy could widen or narrow health disparities depending on whether social risk factors entered the models. Each transition taught me how systems that appear neutral can produce deeply unequal outcomes.</w:t>
+        <w:t>My path to this understanding was not linear. I grew up in China and came to the United States for college, where I quickly learned that navigating an unfamiliar academic system requires more than intellectual ability. I did not know how to approach professors during office hours, how to ask for recommendation letters, or how graduate school applications worked, and nobody in my family had experience with American higher education. These early struggles gave me a visceral understanding of the hidden curriculum, the unwritten rules that determine academic success but are never formally taught. Later, while completing my bachelor's degree in economics at Boston University, I studied how markets allocate resources and began questioning who gets left out of those models. While earning my master's in education policy at Stanford University, I investigated how higher education systems in different countries open or close doors for students from disadvantaged backgrounds. During nearly three years developing Medicare cost measures, I saw firsthand how payment policy decisions could widen or narrow health disparities depending on whether social risk factors were incorporated into the models. Each transition taught me how systems that appear neutral can produce deeply unequal outcomes.</w:t>
       </w:r>
     </w:p>
     <w:p>
       <w:r>
-        <w:t>These experiences keep me attentive to the barriers underrepresented students face. First-generation students often lack access to the professional networks and funding opportunities that accelerate academic careers. Students from communities directly affected by health disparities bring invaluable lived expertise, yet they may not see their experiences reflected in course materials built around the populations that dominate the research literature. Students from underrepresented backgrounds frequently carry invisible burdens, serving as cultural translators, supporting family members financially, or managing the psychological weight of studying inequities that touch their own communities. I have mentored students navigating each of these challenges. One mentee, a first-generation Latina student, told me she had never considered graduate school until our conversations about her research potential. Another student, whose family had experienced the very food insecurity our research project examined, brought insights that fundamentally improved how we interpreted our data. These relationships have taught me that inclusion is not achieved through policy statements alone. It requires creating conditions in which students experience their full identities as assets rather than obstacles.</w:t>
+        <w:t>These experiences make me attentive to the specific barriers that underrepresented students face. First-generation students often lack access to the professional networks and funding opportunities that accelerate academic careers. Students from communities directly affected by health disparities bring invaluable lived expertise, yet they may not see their experiences reflected in course materials built around the populations that dominate the research literature. Students from underrepresented backgrounds frequently carry invisible burdens, serving as cultural translators, supporting family members financially, or managing the psychological weight of studying inequities that touch their own communities. I have mentored students navigating each of these challenges. One mentee, a first-generation Latina student, told me she had never considered graduate school as a possibility until our conversations about her research potential. Another student, whose family had experienced the very food insecurity our research project examined, brought insights that fundamentally improved how we interpreted our data. These relationships have taught me that inclusion is not achieved through policy statements alone. It requires creating conditions in which students experience their full identities as assets rather than obstacles.</w:t>
       </w:r>
     </w:p>
     <w:p>
@@ -92,24 +77,15 @@
         <w:rPr>
           <w:highlight w:val="yellow"/>
         </w:rPr>
-        <w:t>I translate this double vision into concrete classroom practice.</w:t>
+        <w:t>Creating those conditions is the daily work of my classroom.</w:t>
       </w:r>
       <w:r>
-        <w:t xml:space="preserve"> Teaching at UC Irvine, both a Hispanic-Serving Institution and an Asian American and Native American Pacific Islander-Serving Institution, I have worked with many first-generation students, students from immigrant families, working students, and student caregivers. </w:t>
-      </w:r>
-      <w:r>
-        <w:rPr>
-          <w:highlight w:val="yellow"/>
-        </w:rPr>
-        <w:t>Rather than teaching to an average that fits no one,</w:t>
-      </w:r>
-      <w:r>
-        <w:t xml:space="preserve"> I proactively design multiple pathways to success. I post materials early for students balancing work schedules, communicate with a clarity that supports English learners, and vary assessment formats so students can demonstrate mastery in ways aligned with their strengths. When one student's performance declined under caregiving responsibilities, we worked together on a flexible completion plan that honored their family and their learning goals. When another lacked reliable technology, I connected them with campus resources and adjusted deadlines. Students notice this support. One observed that I am “very fast in responding and finding solutions, creating an equitable learning environment,” and another reflected that mine was “the only class I have taken that truly considered the mental health of students.” I also intentionally select case studies and datasets reflecting the communities my students come from. This draws on my experience designing and evaluating culturally tailored cardiovascular interventions with Latino and Vietnamese families, work that taught me cultural competency is built through partnership rather than assumption. I treat systemic barriers to learning as the educational counterpart of the structural determinants of health, which makes inclusive teaching inseparable from the content of public health itself.</w:t>
+        <w:t xml:space="preserve"> Teaching at UC Irvine, a diverse public research university that is both a Hispanic-Serving Institution and an Asian American and Native American Pacific Islander-Serving Institution, I have worked with many first-generation students, students from immigrant families, working students, and student caregivers. Rather than teaching to an average that fits no one, I proactively design multiple pathways to success. I post materials early for students balancing work schedules, communicate with a clarity that supports English learners, and vary assessment formats so students can demonstrate mastery in ways aligned with their strengths. When one student's performance declined under caregiving responsibilities, we worked together on a flexible completion plan that honored both their family and their learning goals. When another lacked reliable technology, I connected them with campus resources and adjusted deadlines. Students notice this support. One observed that I am “very fast in responding and finding solutions, creating an equitable learning environment,” and another reflected that mine was “the only class I have taken that truly considered the mental health of students.” I also intentionally select case studies and datasets reflecting the communities my students come from. This draws on my experience designing and evaluating culturally tailored cardiovascular interventions with Latino and Vietnamese families, work that taught me cultural competency is built through partnership rather than assumption. I treat systemic barriers to learning as the educational counterpart of the structural determinants of health, which makes inclusive teaching inseparable from the content of public health itself.</w:t>
       </w:r>
     </w:p>
     <w:p>
       <w:r>
-        <w:t>Beyond my own classroom, I work to widen pathways into the profession. Through UC Irvine's Next Gen Pathways Program, I mentor incoming graduate students from underrepresented backgrounds, focusing on making the hidden curriculum explicit: how to write a conference abstract, how to identify funding opportunities, and how to build a professional network when you do not inherit one. I share my own experiences with rejection and failure, because students from marginalized backgrounds often read setbacks as confirmation that they do not belong, not as a normal part of academic life. In my professional service, I have developed resources for American Public Health Association student members attending their first professional conference and unsure how to navigate it. When I helped train 27 incoming graduate teaching assistants, I made diversity and inclusion a core workshop topic, so inclusive practice multiplies through every classroom those new instructors will lead.</w:t>
+        <w:t>Beyond my own classroom, I work to widen pathways into the profession. Through UC Irvine's Next Gen Pathways Program, I mentor incoming graduate students from underrepresented backgrounds, focusing on making the hidden curriculum explicit: how to write a conference abstract, how to identify funding opportunities, and how to build a professional network when you do not inherit one from your family. I share my own experiences with rejection and failure, because students from marginalized backgrounds often read setbacks as confirmation that they do not belong rather than as a normal part of academic life. In my professional service, I have developed resources for student members of the American Public Health Association who are attending their first professional conference and feel uncertain about navigating that environment. And when I helped train 27 incoming graduate teaching assistants, I made diversity and inclusion a core workshop topic, so that inclusive practice multiplies through every classroom those new instructors will lead.</w:t>
       </w:r>
     </w:p>
     <w:p>

</xml_diff>

<commit_message>
Rework diversity statement as whole: remove averages language, rewire all paragraph transitions
Co-Authored-By: Claude Fable 5 <noreply@anthropic.com>
Claude-Session: https://claude.ai/code/session_01PiEg6Y7uKo8D9Ly2hNuxQc
</commit_message>
<xml_diff>
--- a/stony-brook-application/diversity-statement-highlighted-changes.docx
+++ b/stony-brook-application/diversity-statement-highlighted-changes.docx
@@ -17,7 +17,7 @@
           <w:i/>
           <w:sz w:val="18"/>
         </w:rPr>
-        <w:t>1. Broadened the second direction of your commitment: instead of only 'seeing people hidden inside aggregated statistics,' students now learn to see beyond averages in everything they do, recognize health disparities and their structural causes, treat inequities in their own communities as questions their training can answer, and pursue health for all, not health for some.</w:t>
+        <w:t>1. Removed the word 'averages' everywhere (three places). The classroom parallel now reads 'teaching aimed at an imagined typical student overlooks real students just as an aggregate category obscures a high-risk community,' and paragraph 4 now reads 'Rather than building a single route and expecting every student to fit it.'</w:t>
       </w:r>
     </w:p>
     <w:p>
@@ -26,7 +26,7 @@
           <w:i/>
           <w:sz w:val="18"/>
         </w:rPr>
-        <w:t>2. Replaced 'I translate this double vision into concrete classroom practice' with 'Creating those conditions is the daily work of my classroom,' which links directly to the last sentence of the previous paragraph (creating conditions where identities are assets).</w:t>
+        <w:t>2. Removed 'double vision': it is literally a medical symptom (diplopia), an unintended pun in a public health document. Replaced with 'These twin commitments are the foundation of responsible public health education.'</w:t>
       </w:r>
     </w:p>
     <w:p>
@@ -35,7 +35,25 @@
           <w:i/>
           <w:sz w:val="18"/>
         </w:rPr>
-        <w:t>3. Everything else is your text verbatim, including all the words you restored in your latest version. Word count: 1,121 excluding the title (about 70 over the 1,050 target; optional trims listed in chat if you want to get back under).</w:t>
+        <w:t>3. Restated the two directions crisply before elaborating them: 'seeing my own students clearly, and teaching them to see just as clearly.'</w:t>
+      </w:r>
+    </w:p>
+    <w:p>
+      <w:r>
+        <w:rPr>
+          <w:i/>
+          <w:sz w:val="18"/>
+        </w:rPr>
+        <w:t>4. Rewired every paragraph junction so the statement reads as one argument. Paragraph 2 now opens 'My own path to these commitments was not linear' (picks up 'twin commitments'). Paragraph 3 opens 'Higher education is one of those systems...' (lands paragraph 2's closing thesis about neutral systems on academia itself). Paragraph 4 keeps 'Creating those conditions...' (picks up paragraph 3's ending). Paragraph 5 opens 'Classroom practice, however, is only half the work. Beyond my courses, I work to widen pathways into the profession itself.' Paragraph 6 opens 'However far it multiplies, this work is never finished' (picks up paragraph 5's closing verb 'multiplies').</w:t>
+      </w:r>
+    </w:p>
+    <w:p>
+      <w:r>
+        <w:rPr>
+          <w:i/>
+          <w:sz w:val="18"/>
+        </w:rPr>
+        <w:t>Word count: 1,133 excluding the title.</w:t>
       </w:r>
     </w:p>
     <w:p/>
@@ -50,26 +68,13 @@
     </w:p>
     <w:p>
       <w:r>
-        <w:t xml:space="preserve">My understanding of diversity, equity, and inclusion begins with a simple observation that has shaped my entire career: the way we count people determines who we see. My own research taught me this. When my disaggregated analyses of cardiovascular outcomes broke apart the single Asian American category common in public health data, they revealed Cambodian American communities facing stroke risks four times higher than their Chinese American peers, a disparity the aggregate label had hidden. My community practice taught me the same lesson. At health screenings alongside Latino families, I have seen how guidelines built on studies that underrepresent them can fail the people in front of me. These are questions of social justice, not merely of method, and classrooms have averages of their own: a course designed for an imagined typical student hides real students just as an aggregate category hides a high-risk community. My commitment therefore runs in two directions. I design my courses, mentoring, and service so that no student stays hidden inside my assumptions, </w:t>
+        <w:t xml:space="preserve">My understanding of diversity, equity, and inclusion begins with a simple observation that has shaped my entire career: the way we count people determines who we see. My own research taught me this. When my disaggregated analyses of cardiovascular outcomes broke apart the single Asian American category common in public health data, they revealed Cambodian American communities facing stroke risks four times higher than their Chinese American peers, a disparity the aggregate label had hidden. My community practice taught me the same lesson. At health screenings alongside Latino families, I have seen how guidelines built on studies that underrepresent them can fail the people in front of me. These are questions of social justice, not merely of method. </w:t>
       </w:r>
       <w:r>
         <w:rPr>
           <w:highlight w:val="yellow"/>
         </w:rPr>
-        <w:t>and I train students to see beyond averages in everything they do: to recognize health disparities and the structures that produce them, to treat inequities in their own communities as questions their training can answer, and to pursue health for all, not health for some.</w:t>
-      </w:r>
-      <w:r>
-        <w:t xml:space="preserve"> This double vision is the foundation of responsible public health education.</w:t>
-      </w:r>
-    </w:p>
-    <w:p>
-      <w:r>
-        <w:t>My path to this understanding was not linear. I grew up in China and came to the United States for college, where I quickly learned that navigating an unfamiliar academic system requires more than intellectual ability. I did not know how to approach professors during office hours, how to ask for recommendation letters, or how graduate school applications worked, and nobody in my family had experience with American higher education. These early struggles gave me a visceral understanding of the hidden curriculum, the unwritten rules that determine academic success but are never formally taught. Later, while completing my bachelor's degree in economics at Boston University, I studied how markets allocate resources and began questioning who gets left out of those models. While earning my master's in education policy at Stanford University, I investigated how higher education systems in different countries open or close doors for students from disadvantaged backgrounds. During nearly three years developing Medicare cost measures, I saw firsthand how payment policy decisions could widen or narrow health disparities depending on whether social risk factors were incorporated into the models. Each transition taught me how systems that appear neutral can produce deeply unequal outcomes.</w:t>
-      </w:r>
-    </w:p>
-    <w:p>
-      <w:r>
-        <w:t>These experiences make me attentive to the specific barriers that underrepresented students face. First-generation students often lack access to the professional networks and funding opportunities that accelerate academic careers. Students from communities directly affected by health disparities bring invaluable lived expertise, yet they may not see their experiences reflected in course materials built around the populations that dominate the research literature. Students from underrepresented backgrounds frequently carry invisible burdens, serving as cultural translators, supporting family members financially, or managing the psychological weight of studying inequities that touch their own communities. I have mentored students navigating each of these challenges. One mentee, a first-generation Latina student, told me she had never considered graduate school as a possibility until our conversations about her research potential. Another student, whose family had experienced the very food insecurity our research project examined, brought insights that fundamentally improved how we interpreted our data. These relationships have taught me that inclusion is not achieved through policy statements alone. It requires creating conditions in which students experience their full identities as assets rather than obstacles.</w:t>
+        <w:t>And the same failure of seeing happens in classrooms: teaching aimed at an imagined typical student overlooks real students just as an aggregate category obscures a high-risk community. My commitment therefore runs in two directions: seeing my own students clearly, and teaching them to see just as clearly. I design courses, mentoring, and service so that no student stays hidden inside my assumptions. I also prepare graduates who recognize health disparities and the structures that produce them, who treat inequities in their own communities as questions their training can answer, and who pursue health for all, not health for some. These twin commitments are the foundation of responsible public health education.</w:t>
       </w:r>
     </w:p>
     <w:p>
@@ -77,20 +82,57 @@
         <w:rPr>
           <w:highlight w:val="yellow"/>
         </w:rPr>
-        <w:t>Creating those conditions is the daily work of my classroom.</w:t>
+        <w:t>My own path to these commitments was not linear.</w:t>
       </w:r>
       <w:r>
-        <w:t xml:space="preserve"> Teaching at UC Irvine, a diverse public research university that is both a Hispanic-Serving Institution and an Asian American and Native American Pacific Islander-Serving Institution, I have worked with many first-generation students, students from immigrant families, working students, and student caregivers. Rather than teaching to an average that fits no one, I proactively design multiple pathways to success. I post materials early for students balancing work schedules, communicate with a clarity that supports English learners, and vary assessment formats so students can demonstrate mastery in ways aligned with their strengths. When one student's performance declined under caregiving responsibilities, we worked together on a flexible completion plan that honored both their family and their learning goals. When another lacked reliable technology, I connected them with campus resources and adjusted deadlines. Students notice this support. One observed that I am “very fast in responding and finding solutions, creating an equitable learning environment,” and another reflected that mine was “the only class I have taken that truly considered the mental health of students.” I also intentionally select case studies and datasets reflecting the communities my students come from. This draws on my experience designing and evaluating culturally tailored cardiovascular interventions with Latino and Vietnamese families, work that taught me cultural competency is built through partnership rather than assumption. I treat systemic barriers to learning as the educational counterpart of the structural determinants of health, which makes inclusive teaching inseparable from the content of public health itself.</w:t>
+        <w:t xml:space="preserve"> I grew up in China and came to the United States for college, where I quickly learned that navigating an unfamiliar academic system requires more than intellectual ability. I did not know how to approach professors during office hours, how to ask for recommendation letters, or how graduate school applications worked, and nobody in my family had experience with American higher education. These early struggles gave me a visceral understanding of the hidden curriculum, the unwritten rules that determine academic success but are never formally taught. Later, while completing my bachelor's degree in economics at Boston University, I studied how markets allocate resources and began questioning who gets left out of those models. While earning my master's in education policy at Stanford University, I investigated how higher education systems in different countries open or close doors for students from disadvantaged backgrounds. During nearly three years developing Medicare cost measures, I saw firsthand how payment policy decisions could widen or narrow health disparities depending on whether social risk factors were incorporated into the models. Each transition taught me how systems that appear neutral can produce deeply unequal outcomes.</w:t>
       </w:r>
     </w:p>
     <w:p>
       <w:r>
-        <w:t>Beyond my own classroom, I work to widen pathways into the profession. Through UC Irvine's Next Gen Pathways Program, I mentor incoming graduate students from underrepresented backgrounds, focusing on making the hidden curriculum explicit: how to write a conference abstract, how to identify funding opportunities, and how to build a professional network when you do not inherit one from your family. I share my own experiences with rejection and failure, because students from marginalized backgrounds often read setbacks as confirmation that they do not belong rather than as a normal part of academic life. In my professional service, I have developed resources for student members of the American Public Health Association who are attending their first professional conference and feel uncertain about navigating that environment. And when I helped train 27 incoming graduate teaching assistants, I made diversity and inclusion a core workshop topic, so that inclusive practice multiplies through every classroom those new instructors will lead.</w:t>
+        <w:rPr>
+          <w:highlight w:val="yellow"/>
+        </w:rPr>
+        <w:t>Higher education is one of those systems, and my journey through it keeps me attentive to the specific barriers that underrepresented students face.</w:t>
+      </w:r>
+      <w:r>
+        <w:t xml:space="preserve"> First-generation students often lack access to the professional networks and funding opportunities that accelerate academic careers. Students from communities directly affected by health disparities bring invaluable lived expertise, yet they may not see their experiences reflected in course materials built around the populations that dominate the research literature. Students from underrepresented backgrounds frequently carry invisible burdens, serving as cultural translators, supporting family members financially, or managing the psychological weight of studying inequities that touch their own communities. I have mentored students navigating each of these challenges. One mentee, a first-generation Latina student, told me she had never considered graduate school as a possibility until our conversations about her research potential. Another student, whose family had experienced the very food insecurity our research project examined, brought insights that fundamentally improved how we interpreted our data. These relationships have taught me that inclusion is not achieved through policy statements alone. It requires creating conditions in which students experience their full identities as assets rather than obstacles.</w:t>
       </w:r>
     </w:p>
     <w:p>
       <w:r>
-        <w:t>I also know that this work is never finished. I continue to participate in workshops on inclusive pedagogy, seek honest dialogue with colleagues about supporting marginalized students, and use my role supporting new instructors to help build a teaching community that values equity at its core. I would also welcome curriculum-focused service, because curriculum design decides whose experiences count as core knowledge. A diverse graduate student body enriches learning for everyone, and public health needs professionals who understand the communities they serve from the inside. Through my teaching, mentoring, and service, I am committed to making the pathway from student to public health professional one where diverse backgrounds are cultivated as sources of strength.</w:t>
+        <w:t xml:space="preserve">Creating those conditions is the daily work of my classroom. Teaching at UC Irvine, a diverse public research university that is both a Hispanic-Serving Institution and an Asian American and Native American Pacific Islander-Serving Institution, I have worked with many first-generation students, students from immigrant families, working students, and student caregivers. </w:t>
+      </w:r>
+      <w:r>
+        <w:rPr>
+          <w:highlight w:val="yellow"/>
+        </w:rPr>
+        <w:t>Rather than building a single route and expecting every student to fit it,</w:t>
+      </w:r>
+      <w:r>
+        <w:t xml:space="preserve"> I proactively design multiple pathways to success. I post materials early for students balancing work schedules, communicate with a clarity that supports English learners, and vary assessment formats so students can demonstrate mastery in ways aligned with their strengths. When one student's performance declined under caregiving responsibilities, we worked together on a flexible completion plan that honored both their family and their learning goals. When another lacked reliable technology, I connected them with campus resources and adjusted deadlines. Students notice this support. One observed that I am “very fast in responding and finding solutions, creating an equitable learning environment,” and another reflected that mine was “the only class I have taken that truly considered the mental health of students.” I also intentionally select case studies and datasets reflecting the communities my students come from. This draws on my experience designing and evaluating culturally tailored cardiovascular interventions with Latino and Vietnamese families, work that taught me cultural competency is built through partnership rather than assumption. I treat systemic barriers to learning as the educational counterpart of the structural determinants of health, which makes inclusive teaching inseparable from the content of public health itself.</w:t>
+      </w:r>
+    </w:p>
+    <w:p>
+      <w:r>
+        <w:rPr>
+          <w:highlight w:val="yellow"/>
+        </w:rPr>
+        <w:t>Classroom practice, however, is only half the work. Beyond my courses, I work to widen pathways into the profession itself.</w:t>
+      </w:r>
+      <w:r>
+        <w:t xml:space="preserve"> Through UC Irvine's Next Gen Pathways Program, I mentor incoming graduate students from underrepresented backgrounds, focusing on making the hidden curriculum explicit: how to write a conference abstract, how to identify funding opportunities, and how to build a professional network when you do not inherit one from your family. I share my own experiences with rejection and failure, because students from marginalized backgrounds often read setbacks as confirmation that they do not belong rather than as a normal part of academic life. In my professional service, I have developed resources for student members of the American Public Health Association who are attending their first professional conference and feel uncertain about navigating that environment. And when I helped train 27 incoming graduate teaching assistants, I made diversity and inclusion a core workshop topic, so that inclusive practice multiplies through every classroom those new instructors will lead.</w:t>
+      </w:r>
+    </w:p>
+    <w:p>
+      <w:r>
+        <w:rPr>
+          <w:highlight w:val="yellow"/>
+        </w:rPr>
+        <w:t>However far it multiplies, this work is never finished.</w:t>
+      </w:r>
+      <w:r>
+        <w:t xml:space="preserve"> I continue to participate in workshops on inclusive pedagogy, seek honest dialogue with colleagues about supporting marginalized students, and use my role supporting new instructors to help build a teaching community that values equity at its core. I would also welcome curriculum-focused service, because curriculum design decides whose experiences count as core knowledge. A diverse graduate student body enriches learning for everyone, and public health needs professionals who understand the communities they serve from the inside. Through my teaching, mentoring, and service, I am committed to making the pathway from student to public health professional one where diverse backgrounds are cultivated as sources of strength.</w:t>
       </w:r>
     </w:p>
     <w:sectPr>

</xml_diff>